<commit_message>
Resume: Designer & Builder title, Front-End Design & Build strength
- Title under the name becomes Digital Experience Designer & Builder in every format
- Independent Practice now reads "Digital products and client work", so every role follows "who | what they do"
- The Digital Experience Design strength is replaced by Front-End Design & Build (websites, tools and working prototypes), so the title phrase stops repeating near the top
- Plain-text file names its jobs section "Experience", matching the page, PDF and Word
- Still 2 pages; all content matches across formats; no phone or email in any public file

Co-Authored-By: Claude Opus 5.5 <noreply@anthropic.com>
</commit_message>
<xml_diff>
--- a/Resume_Christin_Gilbert.docx
+++ b/Resume_Christin_Gilbert.docx
@@ -31,7 +31,7 @@
           <w:sz w:val="26"/>
           <w:szCs w:val="26"/>
         </w:rPr>
-        <w:t xml:space="preserve">Digital Experience Designer</w:t>
+        <w:t xml:space="preserve">Digital Experience Designer &amp; Builder</w:t>
       </w:r>
     </w:p>
     <w:p>
@@ -60,7 +60,7 @@
         </w:rPr>
         <w:t xml:space="preserve">   ·   </w:t>
       </w:r>
-      <w:hyperlink w:history="1" r:id="rIdx1jvfzog4xvitduqirnhh">
+      <w:hyperlink w:history="1" r:id="rId0qtqlfpwgyzx1j50aadt0">
         <w:r>
           <w:rPr>
             <w:rFonts w:ascii="Calibri" w:cs="Calibri" w:eastAsia="Calibri" w:hAnsi="Calibri"/>
@@ -84,7 +84,7 @@
         </w:rPr>
         <w:t xml:space="preserve">   ·   </w:t>
       </w:r>
-      <w:hyperlink w:history="1" r:id="rIdnhr5eqjtr0dofvjiqx-qa">
+      <w:hyperlink w:history="1" r:id="rIdrewadw4dhvbfjhcymyy0e">
         <w:r>
           <w:rPr>
             <w:rFonts w:ascii="Calibri" w:cs="Calibri" w:eastAsia="Calibri" w:hAnsi="Calibri"/>
@@ -340,7 +340,7 @@
           <w:sz w:val="21"/>
           <w:szCs w:val="21"/>
         </w:rPr>
-        <w:t xml:space="preserve">Digital Experience Design</w:t>
+        <w:t xml:space="preserve">Front-End Design &amp; Build</w:t>
       </w:r>
     </w:p>
     <w:p>
@@ -357,7 +357,7 @@
           <w:sz w:val="20"/>
           <w:szCs w:val="20"/>
         </w:rPr>
-        <w:t xml:space="preserve">Designed web and product experiences, from research and information architecture to working front-end prototypes.</w:t>
+        <w:t xml:space="preserve">Designs and builds websites, tools and working prototypes with AI-assisted front-end development, taking ideas all the way to a live link.</w:t>
       </w:r>
     </w:p>
     <w:p>
@@ -569,7 +569,7 @@
           <w:sz w:val="20"/>
           <w:szCs w:val="20"/>
         </w:rPr>
-        <w:t xml:space="preserve">Product design and front-end development</w:t>
+        <w:t xml:space="preserve">Digital products and client work</w:t>
       </w:r>
     </w:p>
     <w:p>
@@ -2575,7 +2575,7 @@
       <w:pPr>
         <w:spacing w:after="50"/>
       </w:pPr>
-      <w:hyperlink w:history="1" r:id="rIdbtcvuvbk7labrovzvrbmm">
+      <w:hyperlink w:history="1" r:id="rIdbq-mzi2cskkbsn9dn08rk">
         <w:r>
           <w:rPr>
             <w:rFonts w:ascii="Calibri" w:cs="Calibri" w:eastAsia="Calibri" w:hAnsi="Calibri"/>
@@ -2604,7 +2604,7 @@
       <w:pPr>
         <w:spacing w:after="50"/>
       </w:pPr>
-      <w:hyperlink w:history="1" r:id="rIdd8zfinatzqbyhnwxeif3c">
+      <w:hyperlink w:history="1" r:id="rIdsaytzrvwkli6sjbyvhllg">
         <w:r>
           <w:rPr>
             <w:rFonts w:ascii="Calibri" w:cs="Calibri" w:eastAsia="Calibri" w:hAnsi="Calibri"/>
@@ -2633,7 +2633,7 @@
       <w:pPr>
         <w:spacing w:after="50"/>
       </w:pPr>
-      <w:hyperlink w:history="1" r:id="rIdqsylz0o6m666ljtfoh75q">
+      <w:hyperlink w:history="1" r:id="rId8e4dxgxbnuymn3fnyowl8">
         <w:r>
           <w:rPr>
             <w:rFonts w:ascii="Calibri" w:cs="Calibri" w:eastAsia="Calibri" w:hAnsi="Calibri"/>

</xml_diff>

<commit_message>
Resume: current role titled Digital Experience Designer & Builder
- The independent role now carries the same title as the resume header, replacing "Digital Experience Designer & Tool Builder", which read as a near-duplicate one line apart
- Updated in every format; still 2 pages; no phone or email in any public file

Co-Authored-By: Claude Opus 5.5 <noreply@anthropic.com>
</commit_message>
<xml_diff>
--- a/Resume_Christin_Gilbert.docx
+++ b/Resume_Christin_Gilbert.docx
@@ -60,7 +60,7 @@
         </w:rPr>
         <w:t xml:space="preserve">   ·   </w:t>
       </w:r>
-      <w:hyperlink w:history="1" r:id="rId0qtqlfpwgyzx1j50aadt0">
+      <w:hyperlink w:history="1" r:id="rIdtba_sxeh3utc1wxpyexsx">
         <w:r>
           <w:rPr>
             <w:rFonts w:ascii="Calibri" w:cs="Calibri" w:eastAsia="Calibri" w:hAnsi="Calibri"/>
@@ -84,7 +84,7 @@
         </w:rPr>
         <w:t xml:space="preserve">   ·   </w:t>
       </w:r>
-      <w:hyperlink w:history="1" r:id="rIdrewadw4dhvbfjhcymyy0e">
+      <w:hyperlink w:history="1" r:id="rIdpw_mutobqd7ffne-1pwrz">
         <w:r>
           <w:rPr>
             <w:rFonts w:ascii="Calibri" w:cs="Calibri" w:eastAsia="Calibri" w:hAnsi="Calibri"/>
@@ -530,7 +530,7 @@
           <w:sz w:val="24"/>
           <w:szCs w:val="24"/>
         </w:rPr>
-        <w:t xml:space="preserve">Digital Experience Designer &amp; Tool Builder</w:t>
+        <w:t xml:space="preserve">Digital Experience Designer &amp; Builder</w:t>
       </w:r>
     </w:p>
     <w:p>
@@ -2575,7 +2575,7 @@
       <w:pPr>
         <w:spacing w:after="50"/>
       </w:pPr>
-      <w:hyperlink w:history="1" r:id="rIdbq-mzi2cskkbsn9dn08rk">
+      <w:hyperlink w:history="1" r:id="rIdxjkyv_qrqrwu4ahggdo3j">
         <w:r>
           <w:rPr>
             <w:rFonts w:ascii="Calibri" w:cs="Calibri" w:eastAsia="Calibri" w:hAnsi="Calibri"/>
@@ -2604,7 +2604,7 @@
       <w:pPr>
         <w:spacing w:after="50"/>
       </w:pPr>
-      <w:hyperlink w:history="1" r:id="rIdsaytzrvwkli6sjbyvhllg">
+      <w:hyperlink w:history="1" r:id="rIdz3rz75yzgjsyjq9ilkavy">
         <w:r>
           <w:rPr>
             <w:rFonts w:ascii="Calibri" w:cs="Calibri" w:eastAsia="Calibri" w:hAnsi="Calibri"/>
@@ -2633,7 +2633,7 @@
       <w:pPr>
         <w:spacing w:after="50"/>
       </w:pPr>
-      <w:hyperlink w:history="1" r:id="rId8e4dxgxbnuymn3fnyowl8">
+      <w:hyperlink w:history="1" r:id="rId9wni6o_7ptwcfi5vemf3c">
         <w:r>
           <w:rPr>
             <w:rFonts w:ascii="Calibri" w:cs="Calibri" w:eastAsia="Calibri" w:hAnsi="Calibri"/>

</xml_diff>

<commit_message>
Resume: add Epinette Media (2012 to 2020)
- Adds Founder & Visual Communications Designer, Epinette Media, Sep 2012 to Feb 2020, Vancouver: her own studio for commercial photography and digital design, with one point on campaigns and Google Analytics
- Closes the 2012 to 2019 gap between Digital Rez and The Creative Group
- To keep two pages, three bullets that repeated their role summaries come out (Farmboy licensing, The Creative Group's single bullet, Digital Rez "Partnered with leadership")
- Plain text wraps long company lines within 68 columns; every format matches the page; no phone or email in any public file

Co-Authored-By: Claude Opus 5.5 <noreply@anthropic.com>
</commit_message>
<xml_diff>
--- a/Resume_Christin_Gilbert.docx
+++ b/Resume_Christin_Gilbert.docx
@@ -60,7 +60,7 @@
         </w:rPr>
         <w:t xml:space="preserve">   ·   </w:t>
       </w:r>
-      <w:hyperlink w:history="1" r:id="rIdtba_sxeh3utc1wxpyexsx">
+      <w:hyperlink w:history="1" r:id="rIdj6pwon8qyi6ocmet3hnqe">
         <w:r>
           <w:rPr>
             <w:rFonts w:ascii="Calibri" w:cs="Calibri" w:eastAsia="Calibri" w:hAnsi="Calibri"/>
@@ -84,7 +84,7 @@
         </w:rPr>
         <w:t xml:space="preserve">   ·   </w:t>
       </w:r>
-      <w:hyperlink w:history="1" r:id="rIdpw_mutobqd7ffne-1pwrz">
+      <w:hyperlink w:history="1" r:id="rId7mnetlpmjsisvptk3waum">
         <w:r>
           <w:rPr>
             <w:rFonts w:ascii="Calibri" w:cs="Calibri" w:eastAsia="Calibri" w:hAnsi="Calibri"/>
@@ -1756,6 +1756,96 @@
     </w:p>
     <w:p>
       <w:pPr>
+        <w:keepNext/>
+        <w:spacing w:after="0" w:before="200"/>
+      </w:pPr>
+      <w:r>
+        <w:rPr>
+          <w:rFonts w:ascii="Georgia" w:cs="Georgia" w:eastAsia="Georgia" w:hAnsi="Georgia"/>
+          <w:b w:val="false"/>
+          <w:bCs w:val="false"/>
+          <w:color w:val="1A1423"/>
+          <w:sz w:val="24"/>
+          <w:szCs w:val="24"/>
+        </w:rPr>
+        <w:t xml:space="preserve">Founder &amp; Visual Communications Designer</w:t>
+      </w:r>
+    </w:p>
+    <w:p>
+      <w:pPr>
+        <w:keepNext/>
+        <w:spacing w:after="0"/>
+      </w:pPr>
+      <w:r>
+        <w:rPr>
+          <w:rFonts w:ascii="Calibri" w:cs="Calibri" w:eastAsia="Calibri" w:hAnsi="Calibri"/>
+          <w:b/>
+          <w:bCs/>
+          <w:color w:val="6E4658"/>
+          <w:sz w:val="20"/>
+          <w:szCs w:val="20"/>
+        </w:rPr>
+        <w:t xml:space="preserve">Epinette Media</w:t>
+      </w:r>
+      <w:r>
+        <w:rPr>
+          <w:rFonts w:ascii="Calibri" w:cs="Calibri" w:eastAsia="Calibri" w:hAnsi="Calibri"/>
+          <w:b w:val="false"/>
+          <w:bCs w:val="false"/>
+          <w:color w:val="6E4658"/>
+          <w:sz w:val="20"/>
+          <w:szCs w:val="20"/>
+        </w:rPr>
+        <w:t xml:space="preserve">  |  </w:t>
+      </w:r>
+      <w:r>
+        <w:rPr>
+          <w:rFonts w:ascii="Calibri" w:cs="Calibri" w:eastAsia="Calibri" w:hAnsi="Calibri"/>
+          <w:b/>
+          <w:bCs/>
+          <w:color w:val="6E4658"/>
+          <w:sz w:val="20"/>
+          <w:szCs w:val="20"/>
+        </w:rPr>
+        <w:t xml:space="preserve">Photography, visual storytelling and digital marketing</w:t>
+      </w:r>
+    </w:p>
+    <w:p>
+      <w:pPr>
+        <w:keepNext/>
+        <w:spacing w:after="60"/>
+      </w:pPr>
+      <w:r>
+        <w:rPr>
+          <w:rFonts w:ascii="Calibri" w:cs="Calibri" w:eastAsia="Calibri" w:hAnsi="Calibri"/>
+          <w:b w:val="false"/>
+          <w:bCs w:val="false"/>
+          <w:color w:val="4A3B44"/>
+          <w:sz w:val="18"/>
+          <w:szCs w:val="18"/>
+        </w:rPr>
+        <w:t xml:space="preserve">Sep 2012 – Feb 2020   ·   Vancouver, BC</w:t>
+      </w:r>
+    </w:p>
+    <w:p>
+      <w:pPr>
+        <w:keepNext/>
+        <w:spacing w:after="80" w:line="264"/>
+      </w:pPr>
+      <w:r>
+        <w:rPr>
+          <w:rFonts w:ascii="Calibri" w:cs="Calibri" w:eastAsia="Calibri" w:hAnsi="Calibri"/>
+          <w:b w:val="false"/>
+          <w:bCs w:val="false"/>
+          <w:color w:val="1A1423"/>
+          <w:sz w:val="20"/>
+          <w:szCs w:val="20"/>
+        </w:rPr>
+        <w:t xml:space="preserve">Founded and ran a studio providing commercial photography and digital design for business and editorial clients.</w:t>
+      </w:r>
+    </w:p>
+    <w:p>
+      <w:pPr>
         <w:pStyle w:val="ListParagraph"/>
         <w:numPr>
           <w:ilvl w:val="0"/>
@@ -1772,7 +1862,51 @@
           <w:sz w:val="20"/>
           <w:szCs w:val="20"/>
         </w:rPr>
-        <w:t xml:space="preserve">Developed long-term licensing partnerships through large-scale commercial art installations.</w:t>
+        <w:t xml:space="preserve">Launched </w:t>
+      </w:r>
+      <w:r>
+        <w:rPr>
+          <w:rFonts w:ascii="Calibri" w:cs="Calibri" w:eastAsia="Calibri" w:hAnsi="Calibri"/>
+          <w:b/>
+          <w:bCs/>
+          <w:color w:val="1A1423"/>
+          <w:sz w:val="20"/>
+          <w:szCs w:val="20"/>
+        </w:rPr>
+        <w:t xml:space="preserve">social media and email campaigns</w:t>
+      </w:r>
+      <w:r>
+        <w:rPr>
+          <w:rFonts w:ascii="Calibri" w:cs="Calibri" w:eastAsia="Calibri" w:hAnsi="Calibri"/>
+          <w:b w:val="false"/>
+          <w:bCs w:val="false"/>
+          <w:color w:val="1A1423"/>
+          <w:sz w:val="20"/>
+          <w:szCs w:val="20"/>
+        </w:rPr>
+        <w:t xml:space="preserve"> and used </w:t>
+      </w:r>
+      <w:r>
+        <w:rPr>
+          <w:rFonts w:ascii="Calibri" w:cs="Calibri" w:eastAsia="Calibri" w:hAnsi="Calibri"/>
+          <w:b/>
+          <w:bCs/>
+          <w:color w:val="1A1423"/>
+          <w:sz w:val="20"/>
+          <w:szCs w:val="20"/>
+        </w:rPr>
+        <w:t xml:space="preserve">Google Analytics</w:t>
+      </w:r>
+      <w:r>
+        <w:rPr>
+          <w:rFonts w:ascii="Calibri" w:cs="Calibri" w:eastAsia="Calibri" w:hAnsi="Calibri"/>
+          <w:b w:val="false"/>
+          <w:bCs w:val="false"/>
+          <w:color w:val="1A1423"/>
+          <w:sz w:val="20"/>
+          <w:szCs w:val="20"/>
+        </w:rPr>
+        <w:t xml:space="preserve"> to track performance and guide content decisions.</w:t>
       </w:r>
     </w:p>
     <w:p>
@@ -1850,7 +1984,7 @@
     </w:p>
     <w:p>
       <w:pPr>
-        <w:keepNext/>
+        <w:keepNext w:val="false"/>
         <w:spacing w:after="80" w:line="264"/>
       </w:pPr>
       <w:r>
@@ -1863,6 +1997,96 @@
           <w:szCs w:val="20"/>
         </w:rPr>
         <w:t xml:space="preserve">Supported client teams with visual and digital design through contract placements with a creative staffing agency.</w:t>
+      </w:r>
+    </w:p>
+    <w:p>
+      <w:pPr>
+        <w:keepNext/>
+        <w:spacing w:after="0" w:before="200"/>
+      </w:pPr>
+      <w:r>
+        <w:rPr>
+          <w:rFonts w:ascii="Georgia" w:cs="Georgia" w:eastAsia="Georgia" w:hAnsi="Georgia"/>
+          <w:b w:val="false"/>
+          <w:bCs w:val="false"/>
+          <w:color w:val="1A1423"/>
+          <w:sz w:val="24"/>
+          <w:szCs w:val="24"/>
+        </w:rPr>
+        <w:t xml:space="preserve">UI Designer / Visual Designer</w:t>
+      </w:r>
+    </w:p>
+    <w:p>
+      <w:pPr>
+        <w:keepNext/>
+        <w:spacing w:after="0"/>
+      </w:pPr>
+      <w:r>
+        <w:rPr>
+          <w:rFonts w:ascii="Calibri" w:cs="Calibri" w:eastAsia="Calibri" w:hAnsi="Calibri"/>
+          <w:b/>
+          <w:bCs/>
+          <w:color w:val="6E4658"/>
+          <w:sz w:val="20"/>
+          <w:szCs w:val="20"/>
+        </w:rPr>
+        <w:t xml:space="preserve">Digital Rez International</w:t>
+      </w:r>
+      <w:r>
+        <w:rPr>
+          <w:rFonts w:ascii="Calibri" w:cs="Calibri" w:eastAsia="Calibri" w:hAnsi="Calibri"/>
+          <w:b w:val="false"/>
+          <w:bCs w:val="false"/>
+          <w:color w:val="6E4658"/>
+          <w:sz w:val="20"/>
+          <w:szCs w:val="20"/>
+        </w:rPr>
+        <w:t xml:space="preserve">  |  </w:t>
+      </w:r>
+      <w:r>
+        <w:rPr>
+          <w:rFonts w:ascii="Calibri" w:cs="Calibri" w:eastAsia="Calibri" w:hAnsi="Calibri"/>
+          <w:b/>
+          <w:bCs/>
+          <w:color w:val="6E4658"/>
+          <w:sz w:val="20"/>
+          <w:szCs w:val="20"/>
+        </w:rPr>
+        <w:t xml:space="preserve">Reservation systems for hospitality</w:t>
+      </w:r>
+    </w:p>
+    <w:p>
+      <w:pPr>
+        <w:keepNext/>
+        <w:spacing w:after="60"/>
+      </w:pPr>
+      <w:r>
+        <w:rPr>
+          <w:rFonts w:ascii="Calibri" w:cs="Calibri" w:eastAsia="Calibri" w:hAnsi="Calibri"/>
+          <w:b w:val="false"/>
+          <w:bCs w:val="false"/>
+          <w:color w:val="4A3B44"/>
+          <w:sz w:val="18"/>
+          <w:szCs w:val="18"/>
+        </w:rPr>
+        <w:t xml:space="preserve">Oct 2005 – Feb 2012   ·   Sicamous, BC</w:t>
+      </w:r>
+    </w:p>
+    <w:p>
+      <w:pPr>
+        <w:keepNext/>
+        <w:spacing w:after="80" w:line="264"/>
+      </w:pPr>
+      <w:r>
+        <w:rPr>
+          <w:rFonts w:ascii="Calibri" w:cs="Calibri" w:eastAsia="Calibri" w:hAnsi="Calibri"/>
+          <w:b w:val="false"/>
+          <w:bCs w:val="false"/>
+          <w:color w:val="1A1423"/>
+          <w:sz w:val="20"/>
+          <w:szCs w:val="20"/>
+        </w:rPr>
+        <w:t xml:space="preserve">Began a career in interface design working on reservation software for hospitality businesses.</w:t>
       </w:r>
     </w:p>
     <w:p>
@@ -1883,97 +2107,7 @@
           <w:sz w:val="20"/>
           <w:szCs w:val="20"/>
         </w:rPr>
-        <w:t xml:space="preserve">Delivered design work through contract placements, producing presentation materials, infographics, landing pages and UI elements for stakeholders.</w:t>
-      </w:r>
-    </w:p>
-    <w:p>
-      <w:pPr>
-        <w:keepNext/>
-        <w:spacing w:after="0" w:before="200"/>
-      </w:pPr>
-      <w:r>
-        <w:rPr>
-          <w:rFonts w:ascii="Georgia" w:cs="Georgia" w:eastAsia="Georgia" w:hAnsi="Georgia"/>
-          <w:b w:val="false"/>
-          <w:bCs w:val="false"/>
-          <w:color w:val="1A1423"/>
-          <w:sz w:val="24"/>
-          <w:szCs w:val="24"/>
-        </w:rPr>
-        <w:t xml:space="preserve">UI Designer / Visual Designer</w:t>
-      </w:r>
-    </w:p>
-    <w:p>
-      <w:pPr>
-        <w:keepNext/>
-        <w:spacing w:after="0"/>
-      </w:pPr>
-      <w:r>
-        <w:rPr>
-          <w:rFonts w:ascii="Calibri" w:cs="Calibri" w:eastAsia="Calibri" w:hAnsi="Calibri"/>
-          <w:b/>
-          <w:bCs/>
-          <w:color w:val="6E4658"/>
-          <w:sz w:val="20"/>
-          <w:szCs w:val="20"/>
-        </w:rPr>
-        <w:t xml:space="preserve">Digital Rez International</w:t>
-      </w:r>
-      <w:r>
-        <w:rPr>
-          <w:rFonts w:ascii="Calibri" w:cs="Calibri" w:eastAsia="Calibri" w:hAnsi="Calibri"/>
-          <w:b w:val="false"/>
-          <w:bCs w:val="false"/>
-          <w:color w:val="6E4658"/>
-          <w:sz w:val="20"/>
-          <w:szCs w:val="20"/>
-        </w:rPr>
-        <w:t xml:space="preserve">  |  </w:t>
-      </w:r>
-      <w:r>
-        <w:rPr>
-          <w:rFonts w:ascii="Calibri" w:cs="Calibri" w:eastAsia="Calibri" w:hAnsi="Calibri"/>
-          <w:b/>
-          <w:bCs/>
-          <w:color w:val="6E4658"/>
-          <w:sz w:val="20"/>
-          <w:szCs w:val="20"/>
-        </w:rPr>
-        <w:t xml:space="preserve">Reservation systems for hospitality</w:t>
-      </w:r>
-    </w:p>
-    <w:p>
-      <w:pPr>
-        <w:keepNext/>
-        <w:spacing w:after="60"/>
-      </w:pPr>
-      <w:r>
-        <w:rPr>
-          <w:rFonts w:ascii="Calibri" w:cs="Calibri" w:eastAsia="Calibri" w:hAnsi="Calibri"/>
-          <w:b w:val="false"/>
-          <w:bCs w:val="false"/>
-          <w:color w:val="4A3B44"/>
-          <w:sz w:val="18"/>
-          <w:szCs w:val="18"/>
-        </w:rPr>
-        <w:t xml:space="preserve">Oct 2005 – Feb 2012   ·   Sicamous, BC</w:t>
-      </w:r>
-    </w:p>
-    <w:p>
-      <w:pPr>
-        <w:keepNext/>
-        <w:spacing w:after="80" w:line="264"/>
-      </w:pPr>
-      <w:r>
-        <w:rPr>
-          <w:rFonts w:ascii="Calibri" w:cs="Calibri" w:eastAsia="Calibri" w:hAnsi="Calibri"/>
-          <w:b w:val="false"/>
-          <w:bCs w:val="false"/>
-          <w:color w:val="1A1423"/>
-          <w:sz w:val="20"/>
-          <w:szCs w:val="20"/>
-        </w:rPr>
-        <w:t xml:space="preserve">Began a career in interface design working on reservation software for hospitality businesses.</w:t>
+        <w:t xml:space="preserve">Designed and refined reservation user interfaces and administrative dashboards supporting booking workflows for hospitality clients.</w:t>
       </w:r>
     </w:p>
     <w:p>
@@ -1994,49 +2128,7 @@
           <w:sz w:val="20"/>
           <w:szCs w:val="20"/>
         </w:rPr>
-        <w:t xml:space="preserve">Designed and refined reservation user interfaces and administrative dashboards supporting booking workflows for hospitality clients.</w:t>
-      </w:r>
-    </w:p>
-    <w:p>
-      <w:pPr>
-        <w:pStyle w:val="ListParagraph"/>
-        <w:numPr>
-          <w:ilvl w:val="0"/>
-          <w:numId w:val="2"/>
-        </w:numPr>
-        <w:spacing w:after="40" w:line="264"/>
-      </w:pPr>
-      <w:r>
-        <w:rPr>
-          <w:rFonts w:ascii="Calibri" w:cs="Calibri" w:eastAsia="Calibri" w:hAnsi="Calibri"/>
-          <w:b w:val="false"/>
-          <w:bCs w:val="false"/>
-          <w:color w:val="1A1423"/>
-          <w:sz w:val="20"/>
-          <w:szCs w:val="20"/>
-        </w:rPr>
         <w:t xml:space="preserve">Delivered marketing assets across print and digital channels for international outdoor recreation brands.</w:t>
-      </w:r>
-    </w:p>
-    <w:p>
-      <w:pPr>
-        <w:pStyle w:val="ListParagraph"/>
-        <w:numPr>
-          <w:ilvl w:val="0"/>
-          <w:numId w:val="2"/>
-        </w:numPr>
-        <w:spacing w:after="40" w:line="264"/>
-      </w:pPr>
-      <w:r>
-        <w:rPr>
-          <w:rFonts w:ascii="Calibri" w:cs="Calibri" w:eastAsia="Calibri" w:hAnsi="Calibri"/>
-          <w:b w:val="false"/>
-          <w:bCs w:val="false"/>
-          <w:color w:val="1A1423"/>
-          <w:sz w:val="20"/>
-          <w:szCs w:val="20"/>
-        </w:rPr>
-        <w:t xml:space="preserve">Partnered with leadership to shape interface concepts and digital strategies aligning product functionality with client business objectives.</w:t>
       </w:r>
     </w:p>
     <w:p>
@@ -2575,7 +2667,7 @@
       <w:pPr>
         <w:spacing w:after="50"/>
       </w:pPr>
-      <w:hyperlink w:history="1" r:id="rIdxjkyv_qrqrwu4ahggdo3j">
+      <w:hyperlink w:history="1" r:id="rIdeqd7amq1gp_5jt80tdwx_">
         <w:r>
           <w:rPr>
             <w:rFonts w:ascii="Calibri" w:cs="Calibri" w:eastAsia="Calibri" w:hAnsi="Calibri"/>
@@ -2604,7 +2696,7 @@
       <w:pPr>
         <w:spacing w:after="50"/>
       </w:pPr>
-      <w:hyperlink w:history="1" r:id="rIdz3rz75yzgjsyjq9ilkavy">
+      <w:hyperlink w:history="1" r:id="rIdv6loy__raemvvhgx0vtaw">
         <w:r>
           <w:rPr>
             <w:rFonts w:ascii="Calibri" w:cs="Calibri" w:eastAsia="Calibri" w:hAnsi="Calibri"/>
@@ -2633,7 +2725,7 @@
       <w:pPr>
         <w:spacing w:after="50"/>
       </w:pPr>
-      <w:hyperlink w:history="1" r:id="rId9wni6o_7ptwcfi5vemf3c">
+      <w:hyperlink w:history="1" r:id="rIdlxx2qjso3ernx1by2wkka">
         <w:r>
           <w:rPr>
             <w:rFonts w:ascii="Calibri" w:cs="Calibri" w:eastAsia="Calibri" w:hAnsi="Calibri"/>

</xml_diff>

<commit_message>
Resume: Mozilla event coverage and volunteer user research
- Mozilla work reads "commercial artwork and event coverage"
- Epinette adds: Volunteered on user research with older adults in VR for the Mozilla Foundation
- Cognitive Accessibility strength names the same user research with older adults in VR
- The Content Specialist bullet that repeated its summary comes out to keep two pages
- Every format matches the page; no phone or email in any public file

Co-Authored-By: Claude Opus 5.5 <noreply@anthropic.com>
</commit_message>
<xml_diff>
--- a/Resume_Christin_Gilbert.docx
+++ b/Resume_Christin_Gilbert.docx
@@ -60,7 +60,7 @@
         </w:rPr>
         <w:t xml:space="preserve">   ·   </w:t>
       </w:r>
-      <w:hyperlink w:history="1" r:id="rIdzd4mxeuajyrdlbr6r3o85">
+      <w:hyperlink w:history="1" r:id="rIdxton2euj51vsxdvbqk_df">
         <w:r>
           <w:rPr>
             <w:rFonts w:ascii="Calibri" w:cs="Calibri" w:eastAsia="Calibri" w:hAnsi="Calibri"/>
@@ -84,7 +84,7 @@
         </w:rPr>
         <w:t xml:space="preserve">   ·   </w:t>
       </w:r>
-      <w:hyperlink w:history="1" r:id="rIdw79vsy1awx9un56qonhsr">
+      <w:hyperlink w:history="1" r:id="rIdfwgku5d94xpvxhowzyxas">
         <w:r>
           <w:rPr>
             <w:rFonts w:ascii="Calibri" w:cs="Calibri" w:eastAsia="Calibri" w:hAnsi="Calibri"/>
@@ -391,7 +391,7 @@
           <w:sz w:val="20"/>
           <w:szCs w:val="20"/>
         </w:rPr>
-        <w:t xml:space="preserve">Draws on cognitive neuropsychology training, WCAG-informed practice and VR research with older adults to make content clearer and reduce competing signals in interfaces.</w:t>
+        <w:t xml:space="preserve">Draws on cognitive neuropsychology training, WCAG-informed practice and user research with older adults in VR to make content clearer and reduce competing signals in interfaces.</w:t>
       </w:r>
     </w:p>
     <w:p>
@@ -1334,7 +1334,29 @@
           <w:sz w:val="20"/>
           <w:szCs w:val="20"/>
         </w:rPr>
-        <w:t xml:space="preserve">Produced visual assets for digital campaigns and brand communications across web, social and email.</w:t>
+        <w:t xml:space="preserve">Created the </w:t>
+      </w:r>
+      <w:r>
+        <w:rPr>
+          <w:rFonts w:ascii="Calibri" w:cs="Calibri" w:eastAsia="Calibri" w:hAnsi="Calibri"/>
+          <w:b/>
+          <w:bCs/>
+          <w:color w:val="1A1423"/>
+          <w:sz w:val="20"/>
+          <w:szCs w:val="20"/>
+        </w:rPr>
+        <w:t xml:space="preserve">information architecture</w:t>
+      </w:r>
+      <w:r>
+        <w:rPr>
+          <w:rFonts w:ascii="Calibri" w:cs="Calibri" w:eastAsia="Calibri" w:hAnsi="Calibri"/>
+          <w:b w:val="false"/>
+          <w:bCs w:val="false"/>
+          <w:color w:val="1A1423"/>
+          <w:sz w:val="20"/>
+          <w:szCs w:val="20"/>
+        </w:rPr>
+        <w:t xml:space="preserve"> for the digital asset library: folder hierarchies, file-naming conventions and a separate system for working files.</w:t>
       </w:r>
     </w:p>
     <w:p>
@@ -1355,29 +1377,141 @@
           <w:sz w:val="20"/>
           <w:szCs w:val="20"/>
         </w:rPr>
-        <w:t xml:space="preserve">Created the </w:t>
-      </w:r>
-      <w:r>
-        <w:rPr>
-          <w:rFonts w:ascii="Calibri" w:cs="Calibri" w:eastAsia="Calibri" w:hAnsi="Calibri"/>
-          <w:b/>
-          <w:bCs/>
-          <w:color w:val="1A1423"/>
-          <w:sz w:val="20"/>
-          <w:szCs w:val="20"/>
-        </w:rPr>
-        <w:t xml:space="preserve">information architecture</w:t>
-      </w:r>
-      <w:r>
-        <w:rPr>
-          <w:rFonts w:ascii="Calibri" w:cs="Calibri" w:eastAsia="Calibri" w:hAnsi="Calibri"/>
-          <w:b w:val="false"/>
-          <w:bCs w:val="false"/>
-          <w:color w:val="1A1423"/>
-          <w:sz w:val="20"/>
-          <w:szCs w:val="20"/>
-        </w:rPr>
-        <w:t xml:space="preserve"> for the digital asset library: folder hierarchies, file-naming conventions and a separate system for working files.</w:t>
+        <w:t xml:space="preserve">Built the </w:t>
+      </w:r>
+      <w:r>
+        <w:rPr>
+          <w:rFonts w:ascii="Calibri" w:cs="Calibri" w:eastAsia="Calibri" w:hAnsi="Calibri"/>
+          <w:b/>
+          <w:bCs/>
+          <w:color w:val="1A1423"/>
+          <w:sz w:val="20"/>
+          <w:szCs w:val="20"/>
+        </w:rPr>
+        <w:t xml:space="preserve">SOP for digital assets</w:t>
+      </w:r>
+      <w:r>
+        <w:rPr>
+          <w:rFonts w:ascii="Calibri" w:cs="Calibri" w:eastAsia="Calibri" w:hAnsi="Calibri"/>
+          <w:b w:val="false"/>
+          <w:bCs w:val="false"/>
+          <w:color w:val="1A1423"/>
+          <w:sz w:val="20"/>
+          <w:szCs w:val="20"/>
+        </w:rPr>
+        <w:t xml:space="preserve"> with the team, and added standardized metadata to </w:t>
+      </w:r>
+      <w:r>
+        <w:rPr>
+          <w:rFonts w:ascii="Calibri" w:cs="Calibri" w:eastAsia="Calibri" w:hAnsi="Calibri"/>
+          <w:b/>
+          <w:bCs/>
+          <w:color w:val="1A1423"/>
+          <w:sz w:val="20"/>
+          <w:szCs w:val="20"/>
+        </w:rPr>
+        <w:t xml:space="preserve">6,000+</w:t>
+      </w:r>
+      <w:r>
+        <w:rPr>
+          <w:rFonts w:ascii="Calibri" w:cs="Calibri" w:eastAsia="Calibri" w:hAnsi="Calibri"/>
+          <w:b w:val="false"/>
+          <w:bCs w:val="false"/>
+          <w:color w:val="1A1423"/>
+          <w:sz w:val="20"/>
+          <w:szCs w:val="20"/>
+        </w:rPr>
+        <w:t xml:space="preserve"> photography, video and design files to make the archive searchable.</w:t>
+      </w:r>
+    </w:p>
+    <w:p>
+      <w:pPr>
+        <w:keepNext/>
+        <w:spacing w:after="0" w:before="200"/>
+      </w:pPr>
+      <w:r>
+        <w:rPr>
+          <w:rFonts w:ascii="Georgia" w:cs="Georgia" w:eastAsia="Georgia" w:hAnsi="Georgia"/>
+          <w:b w:val="false"/>
+          <w:bCs w:val="false"/>
+          <w:color w:val="1A1423"/>
+          <w:sz w:val="24"/>
+          <w:szCs w:val="24"/>
+        </w:rPr>
+        <w:t xml:space="preserve">Mentor: Visual Design &amp; Creative Strategy</w:t>
+      </w:r>
+    </w:p>
+    <w:p>
+      <w:pPr>
+        <w:keepNext/>
+        <w:spacing w:after="0"/>
+      </w:pPr>
+      <w:r>
+        <w:rPr>
+          <w:rFonts w:ascii="Calibri" w:cs="Calibri" w:eastAsia="Calibri" w:hAnsi="Calibri"/>
+          <w:b/>
+          <w:bCs/>
+          <w:color w:val="6E4658"/>
+          <w:sz w:val="20"/>
+          <w:szCs w:val="20"/>
+        </w:rPr>
+        <w:t xml:space="preserve">ADPList</w:t>
+      </w:r>
+      <w:r>
+        <w:rPr>
+          <w:rFonts w:ascii="Calibri" w:cs="Calibri" w:eastAsia="Calibri" w:hAnsi="Calibri"/>
+          <w:b w:val="false"/>
+          <w:bCs w:val="false"/>
+          <w:color w:val="6E4658"/>
+          <w:sz w:val="20"/>
+          <w:szCs w:val="20"/>
+        </w:rPr>
+        <w:t xml:space="preserve">  |  </w:t>
+      </w:r>
+      <w:r>
+        <w:rPr>
+          <w:rFonts w:ascii="Calibri" w:cs="Calibri" w:eastAsia="Calibri" w:hAnsi="Calibri"/>
+          <w:b/>
+          <w:bCs/>
+          <w:color w:val="6E4658"/>
+          <w:sz w:val="20"/>
+          <w:szCs w:val="20"/>
+        </w:rPr>
+        <w:t xml:space="preserve">Global mentorship platform</w:t>
+      </w:r>
+    </w:p>
+    <w:p>
+      <w:pPr>
+        <w:keepNext/>
+        <w:spacing w:after="60"/>
+      </w:pPr>
+      <w:r>
+        <w:rPr>
+          <w:rFonts w:ascii="Calibri" w:cs="Calibri" w:eastAsia="Calibri" w:hAnsi="Calibri"/>
+          <w:b w:val="false"/>
+          <w:bCs w:val="false"/>
+          <w:color w:val="4A3B44"/>
+          <w:sz w:val="18"/>
+          <w:szCs w:val="18"/>
+        </w:rPr>
+        <w:t xml:space="preserve">Dec 2022 – Present   ·   Vancouver, BC</w:t>
+      </w:r>
+    </w:p>
+    <w:p>
+      <w:pPr>
+        <w:keepNext/>
+        <w:spacing w:after="80" w:line="264"/>
+      </w:pPr>
+      <w:r>
+        <w:rPr>
+          <w:rFonts w:ascii="Calibri" w:cs="Calibri" w:eastAsia="Calibri" w:hAnsi="Calibri"/>
+          <w:b w:val="false"/>
+          <w:bCs w:val="false"/>
+          <w:color w:val="1A1423"/>
+          <w:sz w:val="20"/>
+          <w:szCs w:val="20"/>
+        </w:rPr>
+        <w:t xml:space="preserve">Mentors designers and marketers around the world in visual design and creative strategy, alongside ongoing design work.</w:t>
       </w:r>
     </w:p>
     <w:p>
@@ -1398,141 +1532,51 @@
           <w:sz w:val="20"/>
           <w:szCs w:val="20"/>
         </w:rPr>
-        <w:t xml:space="preserve">Built the </w:t>
-      </w:r>
-      <w:r>
-        <w:rPr>
-          <w:rFonts w:ascii="Calibri" w:cs="Calibri" w:eastAsia="Calibri" w:hAnsi="Calibri"/>
-          <w:b/>
-          <w:bCs/>
-          <w:color w:val="1A1423"/>
-          <w:sz w:val="20"/>
-          <w:szCs w:val="20"/>
-        </w:rPr>
-        <w:t xml:space="preserve">SOP for digital assets</w:t>
-      </w:r>
-      <w:r>
-        <w:rPr>
-          <w:rFonts w:ascii="Calibri" w:cs="Calibri" w:eastAsia="Calibri" w:hAnsi="Calibri"/>
-          <w:b w:val="false"/>
-          <w:bCs w:val="false"/>
-          <w:color w:val="1A1423"/>
-          <w:sz w:val="20"/>
-          <w:szCs w:val="20"/>
-        </w:rPr>
-        <w:t xml:space="preserve"> with the team, and added standardized metadata to </w:t>
-      </w:r>
-      <w:r>
-        <w:rPr>
-          <w:rFonts w:ascii="Calibri" w:cs="Calibri" w:eastAsia="Calibri" w:hAnsi="Calibri"/>
-          <w:b/>
-          <w:bCs/>
-          <w:color w:val="1A1423"/>
-          <w:sz w:val="20"/>
-          <w:szCs w:val="20"/>
-        </w:rPr>
-        <w:t xml:space="preserve">6,000+</w:t>
-      </w:r>
-      <w:r>
-        <w:rPr>
-          <w:rFonts w:ascii="Calibri" w:cs="Calibri" w:eastAsia="Calibri" w:hAnsi="Calibri"/>
-          <w:b w:val="false"/>
-          <w:bCs w:val="false"/>
-          <w:color w:val="1A1423"/>
-          <w:sz w:val="20"/>
-          <w:szCs w:val="20"/>
-        </w:rPr>
-        <w:t xml:space="preserve"> photography, video and design files to make the archive searchable.</w:t>
-      </w:r>
-    </w:p>
-    <w:p>
-      <w:pPr>
-        <w:keepNext/>
-        <w:spacing w:after="0" w:before="200"/>
-      </w:pPr>
-      <w:r>
-        <w:rPr>
-          <w:rFonts w:ascii="Georgia" w:cs="Georgia" w:eastAsia="Georgia" w:hAnsi="Georgia"/>
-          <w:b w:val="false"/>
-          <w:bCs w:val="false"/>
-          <w:color w:val="1A1423"/>
-          <w:sz w:val="24"/>
-          <w:szCs w:val="24"/>
-        </w:rPr>
-        <w:t xml:space="preserve">Mentor: Visual Design &amp; Creative Strategy</w:t>
-      </w:r>
-    </w:p>
-    <w:p>
-      <w:pPr>
-        <w:keepNext/>
-        <w:spacing w:after="0"/>
-      </w:pPr>
-      <w:r>
-        <w:rPr>
-          <w:rFonts w:ascii="Calibri" w:cs="Calibri" w:eastAsia="Calibri" w:hAnsi="Calibri"/>
-          <w:b/>
-          <w:bCs/>
-          <w:color w:val="6E4658"/>
-          <w:sz w:val="20"/>
-          <w:szCs w:val="20"/>
-        </w:rPr>
-        <w:t xml:space="preserve">ADPList</w:t>
-      </w:r>
-      <w:r>
-        <w:rPr>
-          <w:rFonts w:ascii="Calibri" w:cs="Calibri" w:eastAsia="Calibri" w:hAnsi="Calibri"/>
-          <w:b w:val="false"/>
-          <w:bCs w:val="false"/>
-          <w:color w:val="6E4658"/>
-          <w:sz w:val="20"/>
-          <w:szCs w:val="20"/>
-        </w:rPr>
-        <w:t xml:space="preserve">  |  </w:t>
-      </w:r>
-      <w:r>
-        <w:rPr>
-          <w:rFonts w:ascii="Calibri" w:cs="Calibri" w:eastAsia="Calibri" w:hAnsi="Calibri"/>
-          <w:b/>
-          <w:bCs/>
-          <w:color w:val="6E4658"/>
-          <w:sz w:val="20"/>
-          <w:szCs w:val="20"/>
-        </w:rPr>
-        <w:t xml:space="preserve">Global mentorship platform</w:t>
-      </w:r>
-    </w:p>
-    <w:p>
-      <w:pPr>
-        <w:keepNext/>
-        <w:spacing w:after="60"/>
-      </w:pPr>
-      <w:r>
-        <w:rPr>
-          <w:rFonts w:ascii="Calibri" w:cs="Calibri" w:eastAsia="Calibri" w:hAnsi="Calibri"/>
-          <w:b w:val="false"/>
-          <w:bCs w:val="false"/>
-          <w:color w:val="4A3B44"/>
-          <w:sz w:val="18"/>
-          <w:szCs w:val="18"/>
-        </w:rPr>
-        <w:t xml:space="preserve">Dec 2022 – Present   ·   Vancouver, BC</w:t>
-      </w:r>
-    </w:p>
-    <w:p>
-      <w:pPr>
-        <w:keepNext/>
-        <w:spacing w:after="80" w:line="264"/>
-      </w:pPr>
-      <w:r>
-        <w:rPr>
-          <w:rFonts w:ascii="Calibri" w:cs="Calibri" w:eastAsia="Calibri" w:hAnsi="Calibri"/>
-          <w:b w:val="false"/>
-          <w:bCs w:val="false"/>
-          <w:color w:val="1A1423"/>
-          <w:sz w:val="20"/>
-          <w:szCs w:val="20"/>
-        </w:rPr>
-        <w:t xml:space="preserve">Mentors designers and marketers around the world in visual design and creative strategy, alongside ongoing design work.</w:t>
+        <w:t xml:space="preserve">Conducted </w:t>
+      </w:r>
+      <w:r>
+        <w:rPr>
+          <w:rFonts w:ascii="Calibri" w:cs="Calibri" w:eastAsia="Calibri" w:hAnsi="Calibri"/>
+          <w:b/>
+          <w:bCs/>
+          <w:color w:val="1A1423"/>
+          <w:sz w:val="20"/>
+          <w:szCs w:val="20"/>
+        </w:rPr>
+        <w:t xml:space="preserve">100+ mentoring sessions</w:t>
+      </w:r>
+      <w:r>
+        <w:rPr>
+          <w:rFonts w:ascii="Calibri" w:cs="Calibri" w:eastAsia="Calibri" w:hAnsi="Calibri"/>
+          <w:b w:val="false"/>
+          <w:bCs w:val="false"/>
+          <w:color w:val="1A1423"/>
+          <w:sz w:val="20"/>
+          <w:szCs w:val="20"/>
+        </w:rPr>
+        <w:t xml:space="preserve"> supporting designers and marketers across </w:t>
+      </w:r>
+      <w:r>
+        <w:rPr>
+          <w:rFonts w:ascii="Calibri" w:cs="Calibri" w:eastAsia="Calibri" w:hAnsi="Calibri"/>
+          <w:b/>
+          <w:bCs/>
+          <w:color w:val="1A1423"/>
+          <w:sz w:val="20"/>
+          <w:szCs w:val="20"/>
+        </w:rPr>
+        <w:t xml:space="preserve">10+ countries</w:t>
+      </w:r>
+      <w:r>
+        <w:rPr>
+          <w:rFonts w:ascii="Calibri" w:cs="Calibri" w:eastAsia="Calibri" w:hAnsi="Calibri"/>
+          <w:b w:val="false"/>
+          <w:bCs w:val="false"/>
+          <w:color w:val="1A1423"/>
+          <w:sz w:val="20"/>
+          <w:szCs w:val="20"/>
+        </w:rPr>
+        <w:t xml:space="preserve">.</w:t>
       </w:r>
     </w:p>
     <w:p>
@@ -1553,51 +1597,119 @@
           <w:sz w:val="20"/>
           <w:szCs w:val="20"/>
         </w:rPr>
-        <w:t xml:space="preserve">Conducted </w:t>
-      </w:r>
-      <w:r>
-        <w:rPr>
-          <w:rFonts w:ascii="Calibri" w:cs="Calibri" w:eastAsia="Calibri" w:hAnsi="Calibri"/>
-          <w:b/>
-          <w:bCs/>
-          <w:color w:val="1A1423"/>
-          <w:sz w:val="20"/>
-          <w:szCs w:val="20"/>
-        </w:rPr>
-        <w:t xml:space="preserve">100+ mentoring sessions</w:t>
-      </w:r>
-      <w:r>
-        <w:rPr>
-          <w:rFonts w:ascii="Calibri" w:cs="Calibri" w:eastAsia="Calibri" w:hAnsi="Calibri"/>
-          <w:b w:val="false"/>
-          <w:bCs w:val="false"/>
-          <w:color w:val="1A1423"/>
-          <w:sz w:val="20"/>
-          <w:szCs w:val="20"/>
-        </w:rPr>
-        <w:t xml:space="preserve"> supporting designers and marketers across </w:t>
-      </w:r>
-      <w:r>
-        <w:rPr>
-          <w:rFonts w:ascii="Calibri" w:cs="Calibri" w:eastAsia="Calibri" w:hAnsi="Calibri"/>
-          <w:b/>
-          <w:bCs/>
-          <w:color w:val="1A1423"/>
-          <w:sz w:val="20"/>
-          <w:szCs w:val="20"/>
-        </w:rPr>
-        <w:t xml:space="preserve">10+ countries</w:t>
-      </w:r>
-      <w:r>
-        <w:rPr>
-          <w:rFonts w:ascii="Calibri" w:cs="Calibri" w:eastAsia="Calibri" w:hAnsi="Calibri"/>
-          <w:b w:val="false"/>
-          <w:bCs w:val="false"/>
-          <w:color w:val="1A1423"/>
-          <w:sz w:val="20"/>
-          <w:szCs w:val="20"/>
-        </w:rPr>
-        <w:t xml:space="preserve">.</w:t>
+        <w:t xml:space="preserve">Recognized as a </w:t>
+      </w:r>
+      <w:r>
+        <w:rPr>
+          <w:rFonts w:ascii="Calibri" w:cs="Calibri" w:eastAsia="Calibri" w:hAnsi="Calibri"/>
+          <w:b/>
+          <w:bCs/>
+          <w:color w:val="1A1423"/>
+          <w:sz w:val="20"/>
+          <w:szCs w:val="20"/>
+        </w:rPr>
+        <w:t xml:space="preserve">Top 10 ADPList Mentor</w:t>
+      </w:r>
+      <w:r>
+        <w:rPr>
+          <w:rFonts w:ascii="Calibri" w:cs="Calibri" w:eastAsia="Calibri" w:hAnsi="Calibri"/>
+          <w:b w:val="false"/>
+          <w:bCs w:val="false"/>
+          <w:color w:val="1A1423"/>
+          <w:sz w:val="20"/>
+          <w:szCs w:val="20"/>
+        </w:rPr>
+        <w:t xml:space="preserve"> for three consecutive periods from 2024–2025.</w:t>
+      </w:r>
+    </w:p>
+    <w:p>
+      <w:pPr>
+        <w:keepNext/>
+        <w:spacing w:after="0" w:before="200"/>
+      </w:pPr>
+      <w:r>
+        <w:rPr>
+          <w:rFonts w:ascii="Georgia" w:cs="Georgia" w:eastAsia="Georgia" w:hAnsi="Georgia"/>
+          <w:b w:val="false"/>
+          <w:bCs w:val="false"/>
+          <w:color w:val="1A1423"/>
+          <w:sz w:val="24"/>
+          <w:szCs w:val="24"/>
+        </w:rPr>
+        <w:t xml:space="preserve">Artist Partner: Commercial Artist</w:t>
+      </w:r>
+    </w:p>
+    <w:p>
+      <w:pPr>
+        <w:keepNext/>
+        <w:spacing w:after="0"/>
+      </w:pPr>
+      <w:r>
+        <w:rPr>
+          <w:rFonts w:ascii="Calibri" w:cs="Calibri" w:eastAsia="Calibri" w:hAnsi="Calibri"/>
+          <w:b/>
+          <w:bCs/>
+          <w:color w:val="6E4658"/>
+          <w:sz w:val="20"/>
+          <w:szCs w:val="20"/>
+        </w:rPr>
+        <w:t xml:space="preserve">Farmboy Fine Arts®</w:t>
+      </w:r>
+      <w:r>
+        <w:rPr>
+          <w:rFonts w:ascii="Calibri" w:cs="Calibri" w:eastAsia="Calibri" w:hAnsi="Calibri"/>
+          <w:b w:val="false"/>
+          <w:bCs w:val="false"/>
+          <w:color w:val="6E4658"/>
+          <w:sz w:val="20"/>
+          <w:szCs w:val="20"/>
+        </w:rPr>
+        <w:t xml:space="preserve">  |  </w:t>
+      </w:r>
+      <w:r>
+        <w:rPr>
+          <w:rFonts w:ascii="Calibri" w:cs="Calibri" w:eastAsia="Calibri" w:hAnsi="Calibri"/>
+          <w:b/>
+          <w:bCs/>
+          <w:color w:val="6E4658"/>
+          <w:sz w:val="20"/>
+          <w:szCs w:val="20"/>
+        </w:rPr>
+        <w:t xml:space="preserve">Commercial art consultancy</w:t>
+      </w:r>
+    </w:p>
+    <w:p>
+      <w:pPr>
+        <w:keepNext/>
+        <w:spacing w:after="60"/>
+      </w:pPr>
+      <w:r>
+        <w:rPr>
+          <w:rFonts w:ascii="Calibri" w:cs="Calibri" w:eastAsia="Calibri" w:hAnsi="Calibri"/>
+          <w:b w:val="false"/>
+          <w:bCs w:val="false"/>
+          <w:color w:val="4A3B44"/>
+          <w:sz w:val="18"/>
+          <w:szCs w:val="18"/>
+        </w:rPr>
+        <w:t xml:space="preserve">Feb 2009 – Present   ·   Vancouver, BC</w:t>
+      </w:r>
+    </w:p>
+    <w:p>
+      <w:pPr>
+        <w:keepNext/>
+        <w:spacing w:after="80" w:line="264"/>
+      </w:pPr>
+      <w:r>
+        <w:rPr>
+          <w:rFonts w:ascii="Calibri" w:cs="Calibri" w:eastAsia="Calibri" w:hAnsi="Calibri"/>
+          <w:b w:val="false"/>
+          <w:bCs w:val="false"/>
+          <w:color w:val="1A1423"/>
+          <w:sz w:val="20"/>
+          <w:szCs w:val="20"/>
+        </w:rPr>
+        <w:t xml:space="preserve">Creates and licenses original artwork for large-scale commercial interiors through a long-term artist partnership.</w:t>
       </w:r>
     </w:p>
     <w:p>
@@ -1618,29 +1730,29 @@
           <w:sz w:val="20"/>
           <w:szCs w:val="20"/>
         </w:rPr>
-        <w:t xml:space="preserve">Recognized as a </w:t>
-      </w:r>
-      <w:r>
-        <w:rPr>
-          <w:rFonts w:ascii="Calibri" w:cs="Calibri" w:eastAsia="Calibri" w:hAnsi="Calibri"/>
-          <w:b/>
-          <w:bCs/>
-          <w:color w:val="1A1423"/>
-          <w:sz w:val="20"/>
-          <w:szCs w:val="20"/>
-        </w:rPr>
-        <w:t xml:space="preserve">Top 10 ADPList Mentor</w:t>
-      </w:r>
-      <w:r>
-        <w:rPr>
-          <w:rFonts w:ascii="Calibri" w:cs="Calibri" w:eastAsia="Calibri" w:hAnsi="Calibri"/>
-          <w:b w:val="false"/>
-          <w:bCs w:val="false"/>
-          <w:color w:val="1A1423"/>
-          <w:sz w:val="20"/>
-          <w:szCs w:val="20"/>
-        </w:rPr>
-        <w:t xml:space="preserve"> for three consecutive periods from 2024–2025.</w:t>
+        <w:t xml:space="preserve">Partnered with global brands to create </w:t>
+      </w:r>
+      <w:r>
+        <w:rPr>
+          <w:rFonts w:ascii="Calibri" w:cs="Calibri" w:eastAsia="Calibri" w:hAnsi="Calibri"/>
+          <w:b/>
+          <w:bCs/>
+          <w:color w:val="1A1423"/>
+          <w:sz w:val="20"/>
+          <w:szCs w:val="20"/>
+        </w:rPr>
+        <w:t xml:space="preserve">bespoke artwork</w:t>
+      </w:r>
+      <w:r>
+        <w:rPr>
+          <w:rFonts w:ascii="Calibri" w:cs="Calibri" w:eastAsia="Calibri" w:hAnsi="Calibri"/>
+          <w:b w:val="false"/>
+          <w:bCs w:val="false"/>
+          <w:color w:val="1A1423"/>
+          <w:sz w:val="20"/>
+          <w:szCs w:val="20"/>
+        </w:rPr>
+        <w:t xml:space="preserve"> for hospitality, healthcare and corporate environments.</w:t>
       </w:r>
     </w:p>
     <w:p>
@@ -1657,7 +1769,7 @@
           <w:sz w:val="24"/>
           <w:szCs w:val="24"/>
         </w:rPr>
-        <w:t xml:space="preserve">Artist Partner: Commercial Artist</w:t>
+        <w:t xml:space="preserve">Visual Designer &amp; Creative Producer</w:t>
       </w:r>
     </w:p>
     <w:p>
@@ -1674,7 +1786,7 @@
           <w:sz w:val="20"/>
           <w:szCs w:val="20"/>
         </w:rPr>
-        <w:t xml:space="preserve">Farmboy Fine Arts®</w:t>
+        <w:t xml:space="preserve">Epinette Media</w:t>
       </w:r>
       <w:r>
         <w:rPr>
@@ -1696,7 +1808,7 @@
           <w:sz w:val="20"/>
           <w:szCs w:val="20"/>
         </w:rPr>
-        <w:t xml:space="preserve">Commercial art consultancy</w:t>
+        <w:t xml:space="preserve">Photography, visual storytelling and digital marketing</w:t>
       </w:r>
     </w:p>
     <w:p>
@@ -1713,7 +1825,7 @@
           <w:sz w:val="18"/>
           <w:szCs w:val="18"/>
         </w:rPr>
-        <w:t xml:space="preserve">Feb 2009 – Present   ·   Vancouver, BC</w:t>
+        <w:t xml:space="preserve">Sep 2012 – Feb 2020   ·   Vancouver, BC</w:t>
       </w:r>
     </w:p>
     <w:p>
@@ -1730,7 +1842,7 @@
           <w:sz w:val="20"/>
           <w:szCs w:val="20"/>
         </w:rPr>
-        <w:t xml:space="preserve">Creates and licenses original artwork for large-scale commercial interiors through a long-term artist partnership.</w:t>
+        <w:t xml:space="preserve">Founded and ran a studio providing commercial photography and digital design for business and editorial clients.</w:t>
       </w:r>
     </w:p>
     <w:p>
@@ -1751,119 +1863,51 @@
           <w:sz w:val="20"/>
           <w:szCs w:val="20"/>
         </w:rPr>
-        <w:t xml:space="preserve">Partnered with global brands to create </w:t>
-      </w:r>
-      <w:r>
-        <w:rPr>
-          <w:rFonts w:ascii="Calibri" w:cs="Calibri" w:eastAsia="Calibri" w:hAnsi="Calibri"/>
-          <w:b/>
-          <w:bCs/>
-          <w:color w:val="1A1423"/>
-          <w:sz w:val="20"/>
-          <w:szCs w:val="20"/>
-        </w:rPr>
-        <w:t xml:space="preserve">bespoke artwork</w:t>
-      </w:r>
-      <w:r>
-        <w:rPr>
-          <w:rFonts w:ascii="Calibri" w:cs="Calibri" w:eastAsia="Calibri" w:hAnsi="Calibri"/>
-          <w:b w:val="false"/>
-          <w:bCs w:val="false"/>
-          <w:color w:val="1A1423"/>
-          <w:sz w:val="20"/>
-          <w:szCs w:val="20"/>
-        </w:rPr>
-        <w:t xml:space="preserve"> for hospitality, healthcare and corporate environments.</w:t>
-      </w:r>
-    </w:p>
-    <w:p>
-      <w:pPr>
-        <w:keepNext/>
-        <w:spacing w:after="0" w:before="200"/>
-      </w:pPr>
-      <w:r>
-        <w:rPr>
-          <w:rFonts w:ascii="Georgia" w:cs="Georgia" w:eastAsia="Georgia" w:hAnsi="Georgia"/>
-          <w:b w:val="false"/>
-          <w:bCs w:val="false"/>
-          <w:color w:val="1A1423"/>
-          <w:sz w:val="24"/>
-          <w:szCs w:val="24"/>
-        </w:rPr>
-        <w:t xml:space="preserve">Visual Designer &amp; Creative Producer</w:t>
-      </w:r>
-    </w:p>
-    <w:p>
-      <w:pPr>
-        <w:keepNext/>
-        <w:spacing w:after="0"/>
-      </w:pPr>
-      <w:r>
-        <w:rPr>
-          <w:rFonts w:ascii="Calibri" w:cs="Calibri" w:eastAsia="Calibri" w:hAnsi="Calibri"/>
-          <w:b/>
-          <w:bCs/>
-          <w:color w:val="6E4658"/>
-          <w:sz w:val="20"/>
-          <w:szCs w:val="20"/>
-        </w:rPr>
-        <w:t xml:space="preserve">Epinette Media</w:t>
-      </w:r>
-      <w:r>
-        <w:rPr>
-          <w:rFonts w:ascii="Calibri" w:cs="Calibri" w:eastAsia="Calibri" w:hAnsi="Calibri"/>
-          <w:b w:val="false"/>
-          <w:bCs w:val="false"/>
-          <w:color w:val="6E4658"/>
-          <w:sz w:val="20"/>
-          <w:szCs w:val="20"/>
-        </w:rPr>
-        <w:t xml:space="preserve">  |  </w:t>
-      </w:r>
-      <w:r>
-        <w:rPr>
-          <w:rFonts w:ascii="Calibri" w:cs="Calibri" w:eastAsia="Calibri" w:hAnsi="Calibri"/>
-          <w:b/>
-          <w:bCs/>
-          <w:color w:val="6E4658"/>
-          <w:sz w:val="20"/>
-          <w:szCs w:val="20"/>
-        </w:rPr>
-        <w:t xml:space="preserve">Photography, visual storytelling and digital marketing</w:t>
-      </w:r>
-    </w:p>
-    <w:p>
-      <w:pPr>
-        <w:keepNext/>
-        <w:spacing w:after="60"/>
-      </w:pPr>
-      <w:r>
-        <w:rPr>
-          <w:rFonts w:ascii="Calibri" w:cs="Calibri" w:eastAsia="Calibri" w:hAnsi="Calibri"/>
-          <w:b w:val="false"/>
-          <w:bCs w:val="false"/>
-          <w:color w:val="4A3B44"/>
-          <w:sz w:val="18"/>
-          <w:szCs w:val="18"/>
-        </w:rPr>
-        <w:t xml:space="preserve">Sep 2012 – Feb 2020   ·   Vancouver, BC</w:t>
-      </w:r>
-    </w:p>
-    <w:p>
-      <w:pPr>
-        <w:keepNext/>
-        <w:spacing w:after="80" w:line="264"/>
-      </w:pPr>
-      <w:r>
-        <w:rPr>
-          <w:rFonts w:ascii="Calibri" w:cs="Calibri" w:eastAsia="Calibri" w:hAnsi="Calibri"/>
-          <w:b w:val="false"/>
-          <w:bCs w:val="false"/>
-          <w:color w:val="1A1423"/>
-          <w:sz w:val="20"/>
-          <w:szCs w:val="20"/>
-        </w:rPr>
-        <w:t xml:space="preserve">Founded and ran a studio providing commercial photography and digital design for business and editorial clients.</w:t>
+        <w:t xml:space="preserve">Created editorial features for </w:t>
+      </w:r>
+      <w:r>
+        <w:rPr>
+          <w:rFonts w:ascii="Calibri" w:cs="Calibri" w:eastAsia="Calibri" w:hAnsi="Calibri"/>
+          <w:b/>
+          <w:bCs/>
+          <w:color w:val="1A1423"/>
+          <w:sz w:val="20"/>
+          <w:szCs w:val="20"/>
+        </w:rPr>
+        <w:t xml:space="preserve">Vancouver Magazine</w:t>
+      </w:r>
+      <w:r>
+        <w:rPr>
+          <w:rFonts w:ascii="Calibri" w:cs="Calibri" w:eastAsia="Calibri" w:hAnsi="Calibri"/>
+          <w:b w:val="false"/>
+          <w:bCs w:val="false"/>
+          <w:color w:val="1A1423"/>
+          <w:sz w:val="20"/>
+          <w:szCs w:val="20"/>
+        </w:rPr>
+        <w:t xml:space="preserve">, and commercial artwork and event coverage for </w:t>
+      </w:r>
+      <w:r>
+        <w:rPr>
+          <w:rFonts w:ascii="Calibri" w:cs="Calibri" w:eastAsia="Calibri" w:hAnsi="Calibri"/>
+          <w:b/>
+          <w:bCs/>
+          <w:color w:val="1A1423"/>
+          <w:sz w:val="20"/>
+          <w:szCs w:val="20"/>
+        </w:rPr>
+        <w:t xml:space="preserve">Mozilla</w:t>
+      </w:r>
+      <w:r>
+        <w:rPr>
+          <w:rFonts w:ascii="Calibri" w:cs="Calibri" w:eastAsia="Calibri" w:hAnsi="Calibri"/>
+          <w:b w:val="false"/>
+          <w:bCs w:val="false"/>
+          <w:color w:val="1A1423"/>
+          <w:sz w:val="20"/>
+          <w:szCs w:val="20"/>
+        </w:rPr>
+        <w:t xml:space="preserve">.</w:t>
       </w:r>
     </w:p>
     <w:p>
@@ -1884,40 +1928,40 @@
           <w:sz w:val="20"/>
           <w:szCs w:val="20"/>
         </w:rPr>
-        <w:t xml:space="preserve">Created editorial features for </w:t>
-      </w:r>
-      <w:r>
-        <w:rPr>
-          <w:rFonts w:ascii="Calibri" w:cs="Calibri" w:eastAsia="Calibri" w:hAnsi="Calibri"/>
-          <w:b/>
-          <w:bCs/>
-          <w:color w:val="1A1423"/>
-          <w:sz w:val="20"/>
-          <w:szCs w:val="20"/>
-        </w:rPr>
-        <w:t xml:space="preserve">Vancouver Magazine</w:t>
-      </w:r>
-      <w:r>
-        <w:rPr>
-          <w:rFonts w:ascii="Calibri" w:cs="Calibri" w:eastAsia="Calibri" w:hAnsi="Calibri"/>
-          <w:b w:val="false"/>
-          <w:bCs w:val="false"/>
-          <w:color w:val="1A1423"/>
-          <w:sz w:val="20"/>
-          <w:szCs w:val="20"/>
-        </w:rPr>
-        <w:t xml:space="preserve">, and commercial artwork and event photography for </w:t>
-      </w:r>
-      <w:r>
-        <w:rPr>
-          <w:rFonts w:ascii="Calibri" w:cs="Calibri" w:eastAsia="Calibri" w:hAnsi="Calibri"/>
-          <w:b/>
-          <w:bCs/>
-          <w:color w:val="1A1423"/>
-          <w:sz w:val="20"/>
-          <w:szCs w:val="20"/>
-        </w:rPr>
-        <w:t xml:space="preserve">Mozilla</w:t>
+        <w:t xml:space="preserve">Volunteered on </w:t>
+      </w:r>
+      <w:r>
+        <w:rPr>
+          <w:rFonts w:ascii="Calibri" w:cs="Calibri" w:eastAsia="Calibri" w:hAnsi="Calibri"/>
+          <w:b/>
+          <w:bCs/>
+          <w:color w:val="1A1423"/>
+          <w:sz w:val="20"/>
+          <w:szCs w:val="20"/>
+        </w:rPr>
+        <w:t xml:space="preserve">user research</w:t>
+      </w:r>
+      <w:r>
+        <w:rPr>
+          <w:rFonts w:ascii="Calibri" w:cs="Calibri" w:eastAsia="Calibri" w:hAnsi="Calibri"/>
+          <w:b w:val="false"/>
+          <w:bCs w:val="false"/>
+          <w:color w:val="1A1423"/>
+          <w:sz w:val="20"/>
+          <w:szCs w:val="20"/>
+        </w:rPr>
+        <w:t xml:space="preserve"> with older adults in VR for the </w:t>
+      </w:r>
+      <w:r>
+        <w:rPr>
+          <w:rFonts w:ascii="Calibri" w:cs="Calibri" w:eastAsia="Calibri" w:hAnsi="Calibri"/>
+          <w:b/>
+          <w:bCs/>
+          <w:color w:val="1A1423"/>
+          <w:sz w:val="20"/>
+          <w:szCs w:val="20"/>
+        </w:rPr>
+        <w:t xml:space="preserve">Mozilla Foundation</w:t>
       </w:r>
       <w:r>
         <w:rPr>
@@ -2767,7 +2811,7 @@
       <w:pPr>
         <w:spacing w:after="50"/>
       </w:pPr>
-      <w:hyperlink w:history="1" r:id="rIdvjtto4nk5nz41w1xrzfa-">
+      <w:hyperlink w:history="1" r:id="rIdpxgjkl7-ngj1sp_hu0xbl">
         <w:r>
           <w:rPr>
             <w:rFonts w:ascii="Calibri" w:cs="Calibri" w:eastAsia="Calibri" w:hAnsi="Calibri"/>
@@ -2796,7 +2840,7 @@
       <w:pPr>
         <w:spacing w:after="50"/>
       </w:pPr>
-      <w:hyperlink w:history="1" r:id="rIdm9qsw_ln395it02fzlxn_">
+      <w:hyperlink w:history="1" r:id="rIdyii87fsgxu9wyylio4gmc">
         <w:r>
           <w:rPr>
             <w:rFonts w:ascii="Calibri" w:cs="Calibri" w:eastAsia="Calibri" w:hAnsi="Calibri"/>
@@ -2825,7 +2869,7 @@
       <w:pPr>
         <w:spacing w:after="50"/>
       </w:pPr>
-      <w:hyperlink w:history="1" r:id="rId8wakvucf3ekwvnxtkyp87">
+      <w:hyperlink w:history="1" r:id="rIdjhefkn9ww7baarbjo-gqw">
         <w:r>
           <w:rPr>
             <w:rFonts w:ascii="Calibri" w:cs="Calibri" w:eastAsia="Calibri" w:hAnsi="Calibri"/>

</xml_diff>

<commit_message>
Resume: Epinette summary names a creative studio
- Epinette Media now opens "Founded a creative studio providing commercial photography and digital design for business and editorial clients."
- Every format matches the page; still 2 pages; no phone or email in any public file

Co-Authored-By: Claude Opus 5.5 <noreply@anthropic.com>
</commit_message>
<xml_diff>
--- a/Resume_Christin_Gilbert.docx
+++ b/Resume_Christin_Gilbert.docx
@@ -60,7 +60,7 @@
         </w:rPr>
         <w:t xml:space="preserve">   ·   </w:t>
       </w:r>
-      <w:hyperlink w:history="1" r:id="rIdxton2euj51vsxdvbqk_df">
+      <w:hyperlink w:history="1" r:id="rIdfprrepuycfy-lutzl8mo7">
         <w:r>
           <w:rPr>
             <w:rFonts w:ascii="Calibri" w:cs="Calibri" w:eastAsia="Calibri" w:hAnsi="Calibri"/>
@@ -84,7 +84,7 @@
         </w:rPr>
         <w:t xml:space="preserve">   ·   </w:t>
       </w:r>
-      <w:hyperlink w:history="1" r:id="rIdfwgku5d94xpvxhowzyxas">
+      <w:hyperlink w:history="1" r:id="rIdzpx3vxtfpvmju8cikcgii">
         <w:r>
           <w:rPr>
             <w:rFonts w:ascii="Calibri" w:cs="Calibri" w:eastAsia="Calibri" w:hAnsi="Calibri"/>
@@ -1842,7 +1842,7 @@
           <w:sz w:val="20"/>
           <w:szCs w:val="20"/>
         </w:rPr>
-        <w:t xml:space="preserve">Founded and ran a studio providing commercial photography and digital design for business and editorial clients.</w:t>
+        <w:t xml:space="preserve">Founded a creative studio providing commercial photography and digital design for business and editorial clients.</w:t>
       </w:r>
     </w:p>
     <w:p>
@@ -2811,7 +2811,7 @@
       <w:pPr>
         <w:spacing w:after="50"/>
       </w:pPr>
-      <w:hyperlink w:history="1" r:id="rIdpxgjkl7-ngj1sp_hu0xbl">
+      <w:hyperlink w:history="1" r:id="rIdiqdmezrola7-zul1jgmaf">
         <w:r>
           <w:rPr>
             <w:rFonts w:ascii="Calibri" w:cs="Calibri" w:eastAsia="Calibri" w:hAnsi="Calibri"/>
@@ -2840,7 +2840,7 @@
       <w:pPr>
         <w:spacing w:after="50"/>
       </w:pPr>
-      <w:hyperlink w:history="1" r:id="rIdyii87fsgxu9wyylio4gmc">
+      <w:hyperlink w:history="1" r:id="rId7_vat3ezrq4d_tclbjt3q">
         <w:r>
           <w:rPr>
             <w:rFonts w:ascii="Calibri" w:cs="Calibri" w:eastAsia="Calibri" w:hAnsi="Calibri"/>
@@ -2869,7 +2869,7 @@
       <w:pPr>
         <w:spacing w:after="50"/>
       </w:pPr>
-      <w:hyperlink w:history="1" r:id="rIdjhefkn9ww7baarbjo-gqw">
+      <w:hyperlink w:history="1" r:id="rIdv4wzmhnm0vnaiyqk93nl4">
         <w:r>
           <w:rPr>
             <w:rFonts w:ascii="Calibri" w:cs="Calibri" w:eastAsia="Calibri" w:hAnsi="Calibri"/>

</xml_diff>